<commit_message>
Literature table (28 papers, one row per paper: authors/year/theory/problem) + RTL table fix in Bessel FA_R2 docx; REVISIONS log
Co-Authored-By: Claude Sonnet 5.5 <noreply@anthropic.com>
</commit_message>
<xml_diff>
--- a/claude/defense/AUTHOR_CH4_SECTION_4_4_TEST3_BESSEL_DERIVATION_FA_R2.docx
+++ b/claude/defense/AUTHOR_CH4_SECTION_4_4_TEST3_BESSEL_DERIVATION_FA_R2.docx
@@ -748,6 +748,7 @@
     <w:tbl>
       <w:tblPr>
         <w:tblStyle w:val="Table"/>
+        <w:bidiVisual/>
         <w:tblW w:type="pct" w:w="5000"/>
         <w:tblLayout w:type="fixed"/>
         <w:tblLook w:firstRow="1" w:lastRow="0" w:firstColumn="0" w:lastColumn="0" w:noHBand="0" w:noVBand="0" w:val="0020"/>
@@ -7080,6 +7081,7 @@
     <w:tbl>
       <w:tblPr>
         <w:tblStyle w:val="Table"/>
+        <w:bidiVisual/>
         <w:tblW w:type="pct" w:w="5000"/>
         <w:tblLayout w:type="fixed"/>
         <w:tblLook w:firstRow="1" w:lastRow="0" w:firstColumn="0" w:lastColumn="0" w:noHBand="0" w:noVBand="0" w:val="0020"/>
@@ -15470,6 +15472,7 @@
     <w:tbl>
       <w:tblPr>
         <w:tblStyle w:val="Table"/>
+        <w:bidiVisual/>
         <w:tblW w:type="auto" w:w="0"/>
         <w:tblLook w:firstRow="1" w:lastRow="0" w:firstColumn="0" w:lastColumn="0" w:noHBand="0" w:noVBand="0" w:val="0020"/>
       </w:tblPr>
@@ -16107,6 +16110,7 @@
     <w:tbl>
       <w:tblPr>
         <w:tblStyle w:val="Table"/>
+        <w:bidiVisual/>
         <w:tblW w:type="auto" w:w="0"/>
         <w:tblLook w:firstRow="1" w:lastRow="0" w:firstColumn="0" w:lastColumn="0" w:noHBand="0" w:noVBand="0" w:val="0020"/>
       </w:tblPr>
@@ -17677,6 +17681,7 @@
     <w:tbl>
       <w:tblPr>
         <w:tblStyle w:val="Table"/>
+        <w:bidiVisual/>
         <w:tblW w:type="auto" w:w="0"/>
         <w:tblLook w:firstRow="1" w:lastRow="0" w:firstColumn="0" w:lastColumn="0" w:noHBand="0" w:noVBand="0" w:val="0020"/>
       </w:tblPr>

</xml_diff>